<commit_message>
updated the RACI docs
</commit_message>
<xml_diff>
--- a/Matrice_RACI_SAE_3.02.docx
+++ b/Matrice_RACI_SAE_3.02.docx
@@ -1,6 +1,6 @@
 
 <file path=word/document.xml><?xml version="1.0" encoding="utf-8"?>
-<w:document xmlns:wpc="http://schemas.microsoft.com/office/word/2010/wordprocessingCanvas" xmlns:cx="http://schemas.microsoft.com/office/drawing/2014/chartex" xmlns:cx1="http://schemas.microsoft.com/office/drawing/2015/9/8/chartex" xmlns:cx2="http://schemas.microsoft.com/office/drawing/2015/10/21/chartex" xmlns:cx3="http://schemas.microsoft.com/office/drawing/2016/5/9/chartex" xmlns:cx4="http://schemas.microsoft.com/office/drawing/2016/5/10/chartex" xmlns:cx5="http://schemas.microsoft.com/office/drawing/2016/5/11/chartex" xmlns:cx6="http://schemas.microsoft.com/office/drawing/2016/5/12/chartex" xmlns:cx7="http://schemas.microsoft.com/office/drawing/2016/5/13/chartex" xmlns:cx8="http://schemas.microsoft.com/office/drawing/2016/5/14/chartex" xmlns:mc="http://schemas.openxmlformats.org/markup-compatibility/2006" xmlns:aink="http://schemas.microsoft.com/office/drawing/2016/ink" xmlns:am3d="http://schemas.microsoft.com/office/drawing/2017/model3d" xmlns:o="urn:schemas-microsoft-com:office:office" xmlns:r="http://schemas.openxmlformats.org/officeDocument/2006/relationships" xmlns:m="http://schemas.openxmlformats.org/officeDocument/2006/math" xmlns:v="urn:schemas-microsoft-com:vml" xmlns:wp14="http://schemas.microsoft.com/office/word/2010/wordprocessingDrawing" xmlns:wp="http://schemas.openxmlformats.org/drawingml/2006/wordprocessingDrawing" xmlns:w10="urn:schemas-microsoft-com:office:word" xmlns:w="http://schemas.openxmlformats.org/wordprocessingml/2006/main" xmlns:w14="http://schemas.microsoft.com/office/word/2010/wordml" xmlns:w15="http://schemas.microsoft.com/office/word/2012/wordml" xmlns:w16cex="http://schemas.microsoft.com/office/word/2018/wordml/cex" xmlns:w16cid="http://schemas.microsoft.com/office/word/2016/wordml/cid" xmlns:w16="http://schemas.microsoft.com/office/word/2018/wordml" xmlns:w16sdtdh="http://schemas.microsoft.com/office/word/2020/wordml/sdtdatahash" xmlns:w16se="http://schemas.microsoft.com/office/word/2015/wordml/symex" xmlns:wpg="http://schemas.microsoft.com/office/word/2010/wordprocessingGroup" xmlns:wpi="http://schemas.microsoft.com/office/word/2010/wordprocessingInk" xmlns:wne="http://schemas.microsoft.com/office/word/2006/wordml" xmlns:wps="http://schemas.microsoft.com/office/word/2010/wordprocessingShape" mc:Ignorable="w14 w15 w16se w16cid w16 w16cex w16sdtdh wp14">
+<w:document xmlns:wpc="http://schemas.microsoft.com/office/word/2010/wordprocessingCanvas" xmlns:cx="http://schemas.microsoft.com/office/drawing/2014/chartex" xmlns:cx1="http://schemas.microsoft.com/office/drawing/2015/9/8/chartex" xmlns:cx2="http://schemas.microsoft.com/office/drawing/2015/10/21/chartex" xmlns:cx3="http://schemas.microsoft.com/office/drawing/2016/5/9/chartex" xmlns:cx4="http://schemas.microsoft.com/office/drawing/2016/5/10/chartex" xmlns:cx5="http://schemas.microsoft.com/office/drawing/2016/5/11/chartex" xmlns:cx6="http://schemas.microsoft.com/office/drawing/2016/5/12/chartex" xmlns:cx7="http://schemas.microsoft.com/office/drawing/2016/5/13/chartex" xmlns:cx8="http://schemas.microsoft.com/office/drawing/2016/5/14/chartex" xmlns:mc="http://schemas.openxmlformats.org/markup-compatibility/2006" xmlns:aink="http://schemas.microsoft.com/office/drawing/2016/ink" xmlns:am3d="http://schemas.microsoft.com/office/drawing/2017/model3d" xmlns:o="urn:schemas-microsoft-com:office:office" xmlns:oel="http://schemas.microsoft.com/office/2019/extlst" xmlns:r="http://schemas.openxmlformats.org/officeDocument/2006/relationships" xmlns:m="http://schemas.openxmlformats.org/officeDocument/2006/math" xmlns:v="urn:schemas-microsoft-com:vml" xmlns:wp14="http://schemas.microsoft.com/office/word/2010/wordprocessingDrawing" xmlns:wp="http://schemas.openxmlformats.org/drawingml/2006/wordprocessingDrawing" xmlns:w10="urn:schemas-microsoft-com:office:word" xmlns:w="http://schemas.openxmlformats.org/wordprocessingml/2006/main" xmlns:w14="http://schemas.microsoft.com/office/word/2010/wordml" xmlns:w15="http://schemas.microsoft.com/office/word/2012/wordml" xmlns:w16cex="http://schemas.microsoft.com/office/word/2018/wordml/cex" xmlns:w16cid="http://schemas.microsoft.com/office/word/2016/wordml/cid" xmlns:w16="http://schemas.microsoft.com/office/word/2018/wordml" xmlns:w16du="http://schemas.microsoft.com/office/word/2023/wordml/word16du" xmlns:w16sdtdh="http://schemas.microsoft.com/office/word/2020/wordml/sdtdatahash" xmlns:w16sdtfl="http://schemas.microsoft.com/office/word/2024/wordml/sdtformatlock" xmlns:w16se="http://schemas.microsoft.com/office/word/2015/wordml/symex" xmlns:wpg="http://schemas.microsoft.com/office/word/2010/wordprocessingGroup" xmlns:wpi="http://schemas.microsoft.com/office/word/2010/wordprocessingInk" xmlns:wne="http://schemas.microsoft.com/office/word/2006/wordml" xmlns:wps="http://schemas.microsoft.com/office/word/2010/wordprocessingShape" mc:Ignorable="w14 w15 w16se w16cid w16 w16cex w16sdtdh w16sdtfl w16du wp14">
   <w:body>
     <w:p>
       <w:pPr>
@@ -42,7 +42,7 @@
     <w:tbl>
       <w:tblPr>
         <w:tblStyle w:val="TableGrid"/>
-        <w:tblW w:w="21240" w:type="dxa"/>
+        <w:tblW w:w="19330" w:type="dxa"/>
         <w:jc w:val="center"/>
         <w:tblLayout w:type="fixed"/>
         <w:tblLook w:val="04A0" w:firstRow="1" w:lastRow="0" w:firstColumn="1" w:lastColumn="0" w:noHBand="0" w:noVBand="1"/>
@@ -53,7 +53,6 @@
         <w:gridCol w:w="1912"/>
         <w:gridCol w:w="1912"/>
         <w:gridCol w:w="1912"/>
-        <w:gridCol w:w="1910"/>
       </w:tblGrid>
       <w:tr>
         <w:trPr>
@@ -96,7 +95,6 @@
                 <w:sz w:val="22"/>
               </w:rPr>
             </w:pPr>
-            <w:proofErr w:type="spellStart"/>
             <w:r>
               <w:rPr>
                 <w:b/>
@@ -104,7 +102,6 @@
               </w:rPr>
               <w:t>Tâche</w:t>
             </w:r>
-            <w:proofErr w:type="spellEnd"/>
           </w:p>
         </w:tc>
         <w:tc>
@@ -170,28 +167,6 @@
                 <w:sz w:val="22"/>
               </w:rPr>
               <w:t>C</w:t>
-            </w:r>
-          </w:p>
-        </w:tc>
-        <w:tc>
-          <w:tcPr>
-            <w:tcW w:w="1910" w:type="dxa"/>
-            <w:shd w:val="clear" w:color="auto" w:fill="D9EAF7"/>
-          </w:tcPr>
-          <w:p>
-            <w:pPr>
-              <w:jc w:val="center"/>
-              <w:rPr>
-                <w:b/>
-                <w:sz w:val="22"/>
-              </w:rPr>
-            </w:pPr>
-            <w:r>
-              <w:rPr>
-                <w:b/>
-                <w:sz w:val="22"/>
-              </w:rPr>
-              <w:t>I</w:t>
             </w:r>
           </w:p>
         </w:tc>
@@ -218,17 +193,8 @@
                 <w:b/>
                 <w:sz w:val="22"/>
               </w:rPr>
-              <w:t xml:space="preserve">Gestion du </w:t>
+              <w:t>Gestion du projet</w:t>
             </w:r>
-            <w:proofErr w:type="spellStart"/>
-            <w:r>
-              <w:rPr>
-                <w:b/>
-                <w:sz w:val="22"/>
-              </w:rPr>
-              <w:t>projet</w:t>
-            </w:r>
-            <w:proofErr w:type="spellEnd"/>
           </w:p>
         </w:tc>
         <w:tc>
@@ -298,20 +264,6 @@
         <w:tc>
           <w:tcPr>
             <w:tcW w:w="1912" w:type="dxa"/>
-          </w:tcPr>
-          <w:p>
-            <w:pPr>
-              <w:spacing w:after="40"/>
-              <w:rPr>
-                <w:sz w:val="22"/>
-                <w:lang w:val="fr-FR"/>
-              </w:rPr>
-            </w:pPr>
-          </w:p>
-        </w:tc>
-        <w:tc>
-          <w:tcPr>
-            <w:tcW w:w="1910" w:type="dxa"/>
           </w:tcPr>
           <w:p>
             <w:pPr>
@@ -356,42 +308,12 @@
                 <w:sz w:val="22"/>
               </w:rPr>
             </w:pPr>
-            <w:proofErr w:type="spellStart"/>
             <w:r>
               <w:rPr>
                 <w:sz w:val="22"/>
               </w:rPr>
-              <w:t>Définir</w:t>
+              <w:t>Définir l’architecture technique générale</w:t>
             </w:r>
-            <w:proofErr w:type="spellEnd"/>
-            <w:r>
-              <w:rPr>
-                <w:sz w:val="22"/>
-              </w:rPr>
-              <w:t xml:space="preserve"> </w:t>
-            </w:r>
-            <w:proofErr w:type="spellStart"/>
-            <w:r>
-              <w:rPr>
-                <w:sz w:val="22"/>
-              </w:rPr>
-              <w:t>l’architecture</w:t>
-            </w:r>
-            <w:proofErr w:type="spellEnd"/>
-            <w:r>
-              <w:rPr>
-                <w:sz w:val="22"/>
-              </w:rPr>
-              <w:t xml:space="preserve"> technique </w:t>
-            </w:r>
-            <w:proofErr w:type="spellStart"/>
-            <w:r>
-              <w:rPr>
-                <w:sz w:val="22"/>
-              </w:rPr>
-              <w:t>générale</w:t>
-            </w:r>
-            <w:proofErr w:type="spellEnd"/>
           </w:p>
         </w:tc>
         <w:tc>
@@ -452,19 +374,6 @@
               </w:rPr>
               <w:t>Adam</w:t>
             </w:r>
-          </w:p>
-        </w:tc>
-        <w:tc>
-          <w:tcPr>
-            <w:tcW w:w="1910" w:type="dxa"/>
-          </w:tcPr>
-          <w:p>
-            <w:pPr>
-              <w:spacing w:after="40"/>
-              <w:rPr>
-                <w:sz w:val="22"/>
-              </w:rPr>
-            </w:pPr>
           </w:p>
         </w:tc>
       </w:tr>
@@ -572,20 +481,6 @@
             </w:r>
           </w:p>
         </w:tc>
-        <w:tc>
-          <w:tcPr>
-            <w:tcW w:w="1910" w:type="dxa"/>
-          </w:tcPr>
-          <w:p>
-            <w:pPr>
-              <w:spacing w:after="40"/>
-              <w:rPr>
-                <w:sz w:val="22"/>
-                <w:lang w:val="fr-FR"/>
-              </w:rPr>
-            </w:pPr>
-          </w:p>
-        </w:tc>
       </w:tr>
       <w:tr>
         <w:trPr>
@@ -692,20 +587,6 @@
             </w:r>
           </w:p>
         </w:tc>
-        <w:tc>
-          <w:tcPr>
-            <w:tcW w:w="1910" w:type="dxa"/>
-          </w:tcPr>
-          <w:p>
-            <w:pPr>
-              <w:spacing w:after="40"/>
-              <w:rPr>
-                <w:sz w:val="22"/>
-                <w:lang w:val="fr-FR"/>
-              </w:rPr>
-            </w:pPr>
-          </w:p>
-        </w:tc>
       </w:tr>
       <w:tr>
         <w:trPr>
@@ -812,20 +693,6 @@
             </w:r>
           </w:p>
         </w:tc>
-        <w:tc>
-          <w:tcPr>
-            <w:tcW w:w="1910" w:type="dxa"/>
-          </w:tcPr>
-          <w:p>
-            <w:pPr>
-              <w:spacing w:after="40"/>
-              <w:rPr>
-                <w:sz w:val="22"/>
-                <w:lang w:val="fr-FR"/>
-              </w:rPr>
-            </w:pPr>
-          </w:p>
-        </w:tc>
       </w:tr>
       <w:tr>
         <w:trPr>
@@ -938,20 +805,6 @@
             </w:r>
           </w:p>
         </w:tc>
-        <w:tc>
-          <w:tcPr>
-            <w:tcW w:w="1910" w:type="dxa"/>
-          </w:tcPr>
-          <w:p>
-            <w:pPr>
-              <w:spacing w:after="40"/>
-              <w:rPr>
-                <w:sz w:val="22"/>
-                <w:lang w:val="fr-FR"/>
-              </w:rPr>
-            </w:pPr>
-          </w:p>
-        </w:tc>
       </w:tr>
       <w:tr>
         <w:trPr>
@@ -1058,27 +911,6 @@
             </w:r>
           </w:p>
         </w:tc>
-        <w:tc>
-          <w:tcPr>
-            <w:tcW w:w="1910" w:type="dxa"/>
-          </w:tcPr>
-          <w:p>
-            <w:pPr>
-              <w:spacing w:after="40"/>
-              <w:rPr>
-                <w:sz w:val="22"/>
-                <w:lang w:val="fr-FR"/>
-              </w:rPr>
-            </w:pPr>
-            <w:r>
-              <w:rPr>
-                <w:sz w:val="22"/>
-                <w:lang w:val="fr-FR"/>
-              </w:rPr>
-              <w:t>Adam</w:t>
-            </w:r>
-          </w:p>
-        </w:tc>
       </w:tr>
       <w:tr>
         <w:trPr>
@@ -1178,27 +1010,6 @@
             </w:pPr>
           </w:p>
         </w:tc>
-        <w:tc>
-          <w:tcPr>
-            <w:tcW w:w="1910" w:type="dxa"/>
-          </w:tcPr>
-          <w:p>
-            <w:pPr>
-              <w:spacing w:after="40"/>
-              <w:rPr>
-                <w:sz w:val="22"/>
-                <w:lang w:val="fr-FR"/>
-              </w:rPr>
-            </w:pPr>
-            <w:r>
-              <w:rPr>
-                <w:sz w:val="22"/>
-                <w:lang w:val="fr-FR"/>
-              </w:rPr>
-              <w:t>Adam</w:t>
-            </w:r>
-          </w:p>
-        </w:tc>
       </w:tr>
       <w:tr>
         <w:trPr>
@@ -1298,27 +1109,6 @@
             </w:pPr>
           </w:p>
         </w:tc>
-        <w:tc>
-          <w:tcPr>
-            <w:tcW w:w="1910" w:type="dxa"/>
-          </w:tcPr>
-          <w:p>
-            <w:pPr>
-              <w:spacing w:after="40"/>
-              <w:rPr>
-                <w:sz w:val="22"/>
-                <w:lang w:val="fr-FR"/>
-              </w:rPr>
-            </w:pPr>
-            <w:r>
-              <w:rPr>
-                <w:sz w:val="22"/>
-                <w:lang w:val="fr-FR"/>
-              </w:rPr>
-              <w:t>Adam</w:t>
-            </w:r>
-          </w:p>
-        </w:tc>
       </w:tr>
       <w:tr>
         <w:trPr>
@@ -1425,27 +1215,6 @@
             </w:r>
           </w:p>
         </w:tc>
-        <w:tc>
-          <w:tcPr>
-            <w:tcW w:w="1910" w:type="dxa"/>
-          </w:tcPr>
-          <w:p>
-            <w:pPr>
-              <w:spacing w:after="40"/>
-              <w:rPr>
-                <w:sz w:val="22"/>
-                <w:lang w:val="fr-FR"/>
-              </w:rPr>
-            </w:pPr>
-            <w:r>
-              <w:rPr>
-                <w:sz w:val="22"/>
-                <w:lang w:val="fr-FR"/>
-              </w:rPr>
-              <w:t>Anas</w:t>
-            </w:r>
-          </w:p>
-        </w:tc>
       </w:tr>
       <w:tr>
         <w:trPr>
@@ -1545,27 +1314,6 @@
             </w:pPr>
           </w:p>
         </w:tc>
-        <w:tc>
-          <w:tcPr>
-            <w:tcW w:w="1910" w:type="dxa"/>
-          </w:tcPr>
-          <w:p>
-            <w:pPr>
-              <w:spacing w:after="40"/>
-              <w:rPr>
-                <w:sz w:val="22"/>
-                <w:lang w:val="fr-FR"/>
-              </w:rPr>
-            </w:pPr>
-            <w:r>
-              <w:rPr>
-                <w:sz w:val="22"/>
-                <w:lang w:val="fr-FR"/>
-              </w:rPr>
-              <w:t>Adam</w:t>
-            </w:r>
-          </w:p>
-        </w:tc>
       </w:tr>
       <w:tr>
         <w:trPr>
@@ -1672,27 +1420,6 @@
             </w:r>
           </w:p>
         </w:tc>
-        <w:tc>
-          <w:tcPr>
-            <w:tcW w:w="1910" w:type="dxa"/>
-          </w:tcPr>
-          <w:p>
-            <w:pPr>
-              <w:spacing w:after="40"/>
-              <w:rPr>
-                <w:sz w:val="22"/>
-                <w:lang w:val="fr-FR"/>
-              </w:rPr>
-            </w:pPr>
-            <w:r>
-              <w:rPr>
-                <w:sz w:val="22"/>
-                <w:lang w:val="fr-FR"/>
-              </w:rPr>
-              <w:t>Anas</w:t>
-            </w:r>
-          </w:p>
-        </w:tc>
       </w:tr>
       <w:tr>
         <w:trPr>
@@ -1799,27 +1526,6 @@
             </w:r>
           </w:p>
         </w:tc>
-        <w:tc>
-          <w:tcPr>
-            <w:tcW w:w="1910" w:type="dxa"/>
-          </w:tcPr>
-          <w:p>
-            <w:pPr>
-              <w:spacing w:after="40"/>
-              <w:rPr>
-                <w:sz w:val="22"/>
-                <w:lang w:val="fr-FR"/>
-              </w:rPr>
-            </w:pPr>
-            <w:r>
-              <w:rPr>
-                <w:sz w:val="22"/>
-                <w:lang w:val="fr-FR"/>
-              </w:rPr>
-              <w:t>Anas</w:t>
-            </w:r>
-          </w:p>
-        </w:tc>
       </w:tr>
       <w:tr>
         <w:trPr>
@@ -1843,17 +1549,8 @@
                 <w:b/>
                 <w:sz w:val="22"/>
               </w:rPr>
-              <w:t xml:space="preserve">Base de </w:t>
+              <w:t>Base de données</w:t>
             </w:r>
-            <w:proofErr w:type="spellStart"/>
-            <w:r>
-              <w:rPr>
-                <w:b/>
-                <w:sz w:val="22"/>
-              </w:rPr>
-              <w:t>données</w:t>
-            </w:r>
-            <w:proofErr w:type="spellEnd"/>
           </w:p>
         </w:tc>
         <w:tc>
@@ -1939,20 +1636,6 @@
               </w:rPr>
               <w:t>Adam, Ainul</w:t>
             </w:r>
-          </w:p>
-        </w:tc>
-        <w:tc>
-          <w:tcPr>
-            <w:tcW w:w="1910" w:type="dxa"/>
-          </w:tcPr>
-          <w:p>
-            <w:pPr>
-              <w:spacing w:after="40"/>
-              <w:rPr>
-                <w:sz w:val="22"/>
-                <w:lang w:val="fr-FR"/>
-              </w:rPr>
-            </w:pPr>
           </w:p>
         </w:tc>
       </w:tr>
@@ -2061,20 +1744,6 @@
             </w:r>
           </w:p>
         </w:tc>
-        <w:tc>
-          <w:tcPr>
-            <w:tcW w:w="1910" w:type="dxa"/>
-          </w:tcPr>
-          <w:p>
-            <w:pPr>
-              <w:spacing w:after="40"/>
-              <w:rPr>
-                <w:sz w:val="22"/>
-                <w:lang w:val="fr-FR"/>
-              </w:rPr>
-            </w:pPr>
-          </w:p>
-        </w:tc>
       </w:tr>
       <w:tr>
         <w:trPr>
@@ -2174,27 +1843,6 @@
             </w:pPr>
           </w:p>
         </w:tc>
-        <w:tc>
-          <w:tcPr>
-            <w:tcW w:w="1910" w:type="dxa"/>
-          </w:tcPr>
-          <w:p>
-            <w:pPr>
-              <w:spacing w:after="40"/>
-              <w:rPr>
-                <w:sz w:val="22"/>
-                <w:lang w:val="fr-FR"/>
-              </w:rPr>
-            </w:pPr>
-            <w:r>
-              <w:rPr>
-                <w:sz w:val="22"/>
-                <w:lang w:val="fr-FR"/>
-              </w:rPr>
-              <w:t>Adam, Ainul</w:t>
-            </w:r>
-          </w:p>
-        </w:tc>
       </w:tr>
       <w:tr>
         <w:trPr>
@@ -2301,20 +1949,6 @@
             </w:r>
           </w:p>
         </w:tc>
-        <w:tc>
-          <w:tcPr>
-            <w:tcW w:w="1910" w:type="dxa"/>
-          </w:tcPr>
-          <w:p>
-            <w:pPr>
-              <w:spacing w:after="40"/>
-              <w:rPr>
-                <w:sz w:val="22"/>
-                <w:lang w:val="fr-FR"/>
-              </w:rPr>
-            </w:pPr>
-          </w:p>
-        </w:tc>
       </w:tr>
       <w:tr>
         <w:trPr>
@@ -2421,27 +2055,6 @@
             </w:r>
           </w:p>
         </w:tc>
-        <w:tc>
-          <w:tcPr>
-            <w:tcW w:w="1910" w:type="dxa"/>
-          </w:tcPr>
-          <w:p>
-            <w:pPr>
-              <w:spacing w:after="40"/>
-              <w:rPr>
-                <w:sz w:val="22"/>
-                <w:lang w:val="fr-FR"/>
-              </w:rPr>
-            </w:pPr>
-            <w:r>
-              <w:rPr>
-                <w:sz w:val="22"/>
-                <w:lang w:val="fr-FR"/>
-              </w:rPr>
-              <w:t>Adam</w:t>
-            </w:r>
-          </w:p>
-        </w:tc>
       </w:tr>
       <w:tr>
         <w:trPr>
@@ -2554,20 +2167,6 @@
             </w:r>
           </w:p>
         </w:tc>
-        <w:tc>
-          <w:tcPr>
-            <w:tcW w:w="1910" w:type="dxa"/>
-          </w:tcPr>
-          <w:p>
-            <w:pPr>
-              <w:spacing w:after="40"/>
-              <w:rPr>
-                <w:sz w:val="22"/>
-                <w:lang w:val="fr-FR"/>
-              </w:rPr>
-            </w:pPr>
-          </w:p>
-        </w:tc>
       </w:tr>
       <w:tr>
         <w:trPr>
@@ -2674,27 +2273,6 @@
             </w:r>
           </w:p>
         </w:tc>
-        <w:tc>
-          <w:tcPr>
-            <w:tcW w:w="1910" w:type="dxa"/>
-          </w:tcPr>
-          <w:p>
-            <w:pPr>
-              <w:spacing w:after="40"/>
-              <w:rPr>
-                <w:sz w:val="22"/>
-                <w:lang w:val="fr-FR"/>
-              </w:rPr>
-            </w:pPr>
-            <w:r>
-              <w:rPr>
-                <w:sz w:val="22"/>
-                <w:lang w:val="fr-FR"/>
-              </w:rPr>
-              <w:t>Anas</w:t>
-            </w:r>
-          </w:p>
-        </w:tc>
       </w:tr>
       <w:tr>
         <w:trPr>
@@ -2801,27 +2379,6 @@
             </w:r>
           </w:p>
         </w:tc>
-        <w:tc>
-          <w:tcPr>
-            <w:tcW w:w="1910" w:type="dxa"/>
-          </w:tcPr>
-          <w:p>
-            <w:pPr>
-              <w:spacing w:after="40"/>
-              <w:rPr>
-                <w:sz w:val="22"/>
-                <w:lang w:val="fr-FR"/>
-              </w:rPr>
-            </w:pPr>
-            <w:r>
-              <w:rPr>
-                <w:sz w:val="22"/>
-                <w:lang w:val="fr-FR"/>
-              </w:rPr>
-              <w:t>Ainul</w:t>
-            </w:r>
-          </w:p>
-        </w:tc>
       </w:tr>
       <w:tr>
         <w:trPr>
@@ -2928,27 +2485,6 @@
             </w:r>
           </w:p>
         </w:tc>
-        <w:tc>
-          <w:tcPr>
-            <w:tcW w:w="1910" w:type="dxa"/>
-          </w:tcPr>
-          <w:p>
-            <w:pPr>
-              <w:spacing w:after="40"/>
-              <w:rPr>
-                <w:sz w:val="22"/>
-                <w:lang w:val="fr-FR"/>
-              </w:rPr>
-            </w:pPr>
-            <w:r>
-              <w:rPr>
-                <w:sz w:val="22"/>
-                <w:lang w:val="fr-FR"/>
-              </w:rPr>
-              <w:t>Anas</w:t>
-            </w:r>
-          </w:p>
-        </w:tc>
       </w:tr>
       <w:tr>
         <w:trPr>
@@ -2982,33 +2518,11 @@
                 <w:sz w:val="22"/>
               </w:rPr>
             </w:pPr>
-            <w:proofErr w:type="spellStart"/>
             <w:r>
               <w:rPr>
                 <w:sz w:val="22"/>
               </w:rPr>
-              <w:t>Développer</w:t>
-            </w:r>
-            <w:proofErr w:type="spellEnd"/>
-            <w:r>
-              <w:rPr>
-                <w:sz w:val="22"/>
-              </w:rPr>
-              <w:t xml:space="preserve"> </w:t>
-            </w:r>
-            <w:proofErr w:type="spellStart"/>
-            <w:r>
-              <w:rPr>
-                <w:sz w:val="22"/>
-              </w:rPr>
-              <w:t>l’endpoint</w:t>
-            </w:r>
-            <w:proofErr w:type="spellEnd"/>
-            <w:r>
-              <w:rPr>
-                <w:sz w:val="22"/>
-              </w:rPr>
-              <w:t xml:space="preserve"> JSON /export</w:t>
+              <w:t>Développer l’endpoint JSON /export</w:t>
             </w:r>
           </w:p>
         </w:tc>
@@ -3069,26 +2583,6 @@
                 <w:lang w:val="fr-FR"/>
               </w:rPr>
               <w:t>Ainul</w:t>
-            </w:r>
-          </w:p>
-        </w:tc>
-        <w:tc>
-          <w:tcPr>
-            <w:tcW w:w="1910" w:type="dxa"/>
-          </w:tcPr>
-          <w:p>
-            <w:pPr>
-              <w:spacing w:after="40"/>
-              <w:rPr>
-                <w:sz w:val="22"/>
-              </w:rPr>
-            </w:pPr>
-            <w:r>
-              <w:rPr>
-                <w:sz w:val="22"/>
-                <w:lang w:val="fr-FR"/>
-              </w:rPr>
-              <w:t>Anas</w:t>
             </w:r>
           </w:p>
         </w:tc>
@@ -3110,21 +2604,12 @@
                 <w:sz w:val="22"/>
               </w:rPr>
             </w:pPr>
-            <w:proofErr w:type="spellStart"/>
             <w:r>
               <w:rPr>
                 <w:b/>
                 <w:sz w:val="22"/>
               </w:rPr>
-              <w:t>Intégration</w:t>
-            </w:r>
-            <w:proofErr w:type="spellEnd"/>
-            <w:r>
-              <w:rPr>
-                <w:b/>
-                <w:sz w:val="22"/>
-              </w:rPr>
-              <w:t xml:space="preserve"> et tests</w:t>
+              <w:t>Intégration et tests</w:t>
             </w:r>
           </w:p>
         </w:tc>
@@ -3210,27 +2695,6 @@
                 <w:lang w:val="fr-FR"/>
               </w:rPr>
               <w:t>Adam</w:t>
-            </w:r>
-          </w:p>
-        </w:tc>
-        <w:tc>
-          <w:tcPr>
-            <w:tcW w:w="1910" w:type="dxa"/>
-          </w:tcPr>
-          <w:p>
-            <w:pPr>
-              <w:spacing w:after="40"/>
-              <w:rPr>
-                <w:sz w:val="22"/>
-                <w:lang w:val="fr-FR"/>
-              </w:rPr>
-            </w:pPr>
-            <w:r>
-              <w:rPr>
-                <w:sz w:val="22"/>
-                <w:lang w:val="fr-FR"/>
-              </w:rPr>
-              <w:t>Ainul</w:t>
             </w:r>
           </w:p>
         </w:tc>
@@ -3340,20 +2804,6 @@
             </w:r>
           </w:p>
         </w:tc>
-        <w:tc>
-          <w:tcPr>
-            <w:tcW w:w="1910" w:type="dxa"/>
-          </w:tcPr>
-          <w:p>
-            <w:pPr>
-              <w:spacing w:after="40"/>
-              <w:rPr>
-                <w:sz w:val="22"/>
-                <w:lang w:val="fr-FR"/>
-              </w:rPr>
-            </w:pPr>
-          </w:p>
-        </w:tc>
       </w:tr>
       <w:tr>
         <w:trPr>
@@ -3453,20 +2903,6 @@
             </w:pPr>
           </w:p>
         </w:tc>
-        <w:tc>
-          <w:tcPr>
-            <w:tcW w:w="1910" w:type="dxa"/>
-          </w:tcPr>
-          <w:p>
-            <w:pPr>
-              <w:spacing w:after="40"/>
-              <w:rPr>
-                <w:sz w:val="22"/>
-                <w:lang w:val="fr-FR"/>
-              </w:rPr>
-            </w:pPr>
-          </w:p>
-        </w:tc>
       </w:tr>
       <w:tr>
         <w:trPr>
@@ -3573,20 +3009,6 @@
             </w:r>
           </w:p>
         </w:tc>
-        <w:tc>
-          <w:tcPr>
-            <w:tcW w:w="1910" w:type="dxa"/>
-          </w:tcPr>
-          <w:p>
-            <w:pPr>
-              <w:spacing w:after="40"/>
-              <w:rPr>
-                <w:sz w:val="22"/>
-                <w:lang w:val="fr-FR"/>
-              </w:rPr>
-            </w:pPr>
-          </w:p>
-        </w:tc>
       </w:tr>
       <w:tr>
         <w:trPr>
@@ -3686,20 +3108,6 @@
             </w:pPr>
           </w:p>
         </w:tc>
-        <w:tc>
-          <w:tcPr>
-            <w:tcW w:w="1910" w:type="dxa"/>
-          </w:tcPr>
-          <w:p>
-            <w:pPr>
-              <w:spacing w:after="40"/>
-              <w:rPr>
-                <w:sz w:val="22"/>
-                <w:lang w:val="fr-FR"/>
-              </w:rPr>
-            </w:pPr>
-          </w:p>
-        </w:tc>
       </w:tr>
       <w:tr>
         <w:trPr>
@@ -3718,31 +3126,13 @@
                 <w:sz w:val="22"/>
               </w:rPr>
             </w:pPr>
-            <w:proofErr w:type="spellStart"/>
             <w:r>
               <w:rPr>
                 <w:b/>
                 <w:sz w:val="22"/>
               </w:rPr>
-              <w:t>Livrables</w:t>
+              <w:t>Livrables finaux</w:t>
             </w:r>
-            <w:proofErr w:type="spellEnd"/>
-            <w:r>
-              <w:rPr>
-                <w:b/>
-                <w:sz w:val="22"/>
-              </w:rPr>
-              <w:t xml:space="preserve"> </w:t>
-            </w:r>
-            <w:proofErr w:type="spellStart"/>
-            <w:r>
-              <w:rPr>
-                <w:b/>
-                <w:sz w:val="22"/>
-              </w:rPr>
-              <w:t>finaux</w:t>
-            </w:r>
-            <w:proofErr w:type="spellEnd"/>
           </w:p>
         </w:tc>
         <w:tc>
@@ -3828,20 +3218,6 @@
               </w:rPr>
               <w:t>Ainul</w:t>
             </w:r>
-          </w:p>
-        </w:tc>
-        <w:tc>
-          <w:tcPr>
-            <w:tcW w:w="1910" w:type="dxa"/>
-          </w:tcPr>
-          <w:p>
-            <w:pPr>
-              <w:spacing w:after="40"/>
-              <w:rPr>
-                <w:sz w:val="22"/>
-                <w:lang w:val="fr-FR"/>
-              </w:rPr>
-            </w:pPr>
           </w:p>
         </w:tc>
       </w:tr>
@@ -3950,20 +3326,6 @@
             </w:r>
           </w:p>
         </w:tc>
-        <w:tc>
-          <w:tcPr>
-            <w:tcW w:w="1910" w:type="dxa"/>
-          </w:tcPr>
-          <w:p>
-            <w:pPr>
-              <w:spacing w:after="40"/>
-              <w:rPr>
-                <w:sz w:val="22"/>
-                <w:lang w:val="fr-FR"/>
-              </w:rPr>
-            </w:pPr>
-          </w:p>
-        </w:tc>
       </w:tr>
       <w:tr>
         <w:trPr>
@@ -4063,20 +3425,6 @@
             </w:pPr>
           </w:p>
         </w:tc>
-        <w:tc>
-          <w:tcPr>
-            <w:tcW w:w="1910" w:type="dxa"/>
-          </w:tcPr>
-          <w:p>
-            <w:pPr>
-              <w:spacing w:after="40"/>
-              <w:rPr>
-                <w:sz w:val="22"/>
-                <w:lang w:val="fr-FR"/>
-              </w:rPr>
-            </w:pPr>
-          </w:p>
-        </w:tc>
       </w:tr>
       <w:tr>
         <w:trPr>
@@ -4183,20 +3531,6 @@
             </w:r>
           </w:p>
         </w:tc>
-        <w:tc>
-          <w:tcPr>
-            <w:tcW w:w="1910" w:type="dxa"/>
-          </w:tcPr>
-          <w:p>
-            <w:pPr>
-              <w:spacing w:after="40"/>
-              <w:rPr>
-                <w:sz w:val="22"/>
-                <w:lang w:val="fr-FR"/>
-              </w:rPr>
-            </w:pPr>
-          </w:p>
-        </w:tc>
       </w:tr>
       <w:tr>
         <w:trPr>
@@ -4285,20 +3619,6 @@
         <w:tc>
           <w:tcPr>
             <w:tcW w:w="1912" w:type="dxa"/>
-          </w:tcPr>
-          <w:p>
-            <w:pPr>
-              <w:spacing w:after="40"/>
-              <w:rPr>
-                <w:sz w:val="22"/>
-                <w:lang w:val="fr-FR"/>
-              </w:rPr>
-            </w:pPr>
-          </w:p>
-        </w:tc>
-        <w:tc>
-          <w:tcPr>
-            <w:tcW w:w="1910" w:type="dxa"/>
           </w:tcPr>
           <w:p>
             <w:pPr>
@@ -4336,7 +3656,7 @@
 </file>
 
 <file path=word/numbering.xml><?xml version="1.0" encoding="utf-8"?>
-<w:numbering xmlns:wpc="http://schemas.microsoft.com/office/word/2010/wordprocessingCanvas" xmlns:cx="http://schemas.microsoft.com/office/drawing/2014/chartex" xmlns:cx1="http://schemas.microsoft.com/office/drawing/2015/9/8/chartex" xmlns:cx2="http://schemas.microsoft.com/office/drawing/2015/10/21/chartex" xmlns:cx3="http://schemas.microsoft.com/office/drawing/2016/5/9/chartex" xmlns:cx4="http://schemas.microsoft.com/office/drawing/2016/5/10/chartex" xmlns:cx5="http://schemas.microsoft.com/office/drawing/2016/5/11/chartex" xmlns:cx6="http://schemas.microsoft.com/office/drawing/2016/5/12/chartex" xmlns:cx7="http://schemas.microsoft.com/office/drawing/2016/5/13/chartex" xmlns:cx8="http://schemas.microsoft.com/office/drawing/2016/5/14/chartex" xmlns:mc="http://schemas.openxmlformats.org/markup-compatibility/2006" xmlns:aink="http://schemas.microsoft.com/office/drawing/2016/ink" xmlns:am3d="http://schemas.microsoft.com/office/drawing/2017/model3d" xmlns:o="urn:schemas-microsoft-com:office:office" xmlns:r="http://schemas.openxmlformats.org/officeDocument/2006/relationships" xmlns:m="http://schemas.openxmlformats.org/officeDocument/2006/math" xmlns:v="urn:schemas-microsoft-com:vml" xmlns:wp14="http://schemas.microsoft.com/office/word/2010/wordprocessingDrawing" xmlns:wp="http://schemas.openxmlformats.org/drawingml/2006/wordprocessingDrawing" xmlns:w10="urn:schemas-microsoft-com:office:word" xmlns:w="http://schemas.openxmlformats.org/wordprocessingml/2006/main" xmlns:w14="http://schemas.microsoft.com/office/word/2010/wordml" xmlns:w15="http://schemas.microsoft.com/office/word/2012/wordml" xmlns:w16cex="http://schemas.microsoft.com/office/word/2018/wordml/cex" xmlns:w16cid="http://schemas.microsoft.com/office/word/2016/wordml/cid" xmlns:w16="http://schemas.microsoft.com/office/word/2018/wordml" xmlns:w16sdtdh="http://schemas.microsoft.com/office/word/2020/wordml/sdtdatahash" xmlns:w16se="http://schemas.microsoft.com/office/word/2015/wordml/symex" xmlns:wpg="http://schemas.microsoft.com/office/word/2010/wordprocessingGroup" xmlns:wpi="http://schemas.microsoft.com/office/word/2010/wordprocessingInk" xmlns:wne="http://schemas.microsoft.com/office/word/2006/wordml" xmlns:wps="http://schemas.microsoft.com/office/word/2010/wordprocessingShape" mc:Ignorable="w14 w15 w16se w16cid w16 w16cex w16sdtdh wp14">
+<w:numbering xmlns:wpc="http://schemas.microsoft.com/office/word/2010/wordprocessingCanvas" xmlns:cx="http://schemas.microsoft.com/office/drawing/2014/chartex" xmlns:cx1="http://schemas.microsoft.com/office/drawing/2015/9/8/chartex" xmlns:cx2="http://schemas.microsoft.com/office/drawing/2015/10/21/chartex" xmlns:cx3="http://schemas.microsoft.com/office/drawing/2016/5/9/chartex" xmlns:cx4="http://schemas.microsoft.com/office/drawing/2016/5/10/chartex" xmlns:cx5="http://schemas.microsoft.com/office/drawing/2016/5/11/chartex" xmlns:cx6="http://schemas.microsoft.com/office/drawing/2016/5/12/chartex" xmlns:cx7="http://schemas.microsoft.com/office/drawing/2016/5/13/chartex" xmlns:cx8="http://schemas.microsoft.com/office/drawing/2016/5/14/chartex" xmlns:mc="http://schemas.openxmlformats.org/markup-compatibility/2006" xmlns:aink="http://schemas.microsoft.com/office/drawing/2016/ink" xmlns:am3d="http://schemas.microsoft.com/office/drawing/2017/model3d" xmlns:o="urn:schemas-microsoft-com:office:office" xmlns:oel="http://schemas.microsoft.com/office/2019/extlst" xmlns:r="http://schemas.openxmlformats.org/officeDocument/2006/relationships" xmlns:m="http://schemas.openxmlformats.org/officeDocument/2006/math" xmlns:v="urn:schemas-microsoft-com:vml" xmlns:wp14="http://schemas.microsoft.com/office/word/2010/wordprocessingDrawing" xmlns:wp="http://schemas.openxmlformats.org/drawingml/2006/wordprocessingDrawing" xmlns:w10="urn:schemas-microsoft-com:office:word" xmlns:w="http://schemas.openxmlformats.org/wordprocessingml/2006/main" xmlns:w14="http://schemas.microsoft.com/office/word/2010/wordml" xmlns:w15="http://schemas.microsoft.com/office/word/2012/wordml" xmlns:w16cex="http://schemas.microsoft.com/office/word/2018/wordml/cex" xmlns:w16cid="http://schemas.microsoft.com/office/word/2016/wordml/cid" xmlns:w16="http://schemas.microsoft.com/office/word/2018/wordml" xmlns:w16du="http://schemas.microsoft.com/office/word/2023/wordml/word16du" xmlns:w16sdtdh="http://schemas.microsoft.com/office/word/2020/wordml/sdtdatahash" xmlns:w16sdtfl="http://schemas.microsoft.com/office/word/2024/wordml/sdtformatlock" xmlns:w16se="http://schemas.microsoft.com/office/word/2015/wordml/symex" xmlns:wpg="http://schemas.microsoft.com/office/word/2010/wordprocessingGroup" xmlns:wpi="http://schemas.microsoft.com/office/word/2010/wordprocessingInk" xmlns:wne="http://schemas.microsoft.com/office/word/2006/wordml" xmlns:wps="http://schemas.microsoft.com/office/word/2010/wordprocessingShape" mc:Ignorable="w14 w15 w16se w16cid w16 w16cex w16sdtdh w16sdtfl w16du wp14">
   <w:abstractNum w:abstractNumId="0" w15:restartNumberingAfterBreak="0">
     <w:nsid w:val="FFFFFF7C"/>
     <w:multiLevelType w:val="singleLevel"/>
@@ -4508,38 +3828,38 @@
       </w:rPr>
     </w:lvl>
   </w:abstractNum>
-  <w:num w:numId="1">
+  <w:num w:numId="1" w16cid:durableId="1930113906">
     <w:abstractNumId w:val="8"/>
   </w:num>
-  <w:num w:numId="2">
+  <w:num w:numId="2" w16cid:durableId="2031760320">
     <w:abstractNumId w:val="6"/>
   </w:num>
-  <w:num w:numId="3">
+  <w:num w:numId="3" w16cid:durableId="913467411">
     <w:abstractNumId w:val="5"/>
   </w:num>
-  <w:num w:numId="4">
+  <w:num w:numId="4" w16cid:durableId="1147016114">
     <w:abstractNumId w:val="4"/>
   </w:num>
-  <w:num w:numId="5">
+  <w:num w:numId="5" w16cid:durableId="2075928471">
     <w:abstractNumId w:val="7"/>
   </w:num>
-  <w:num w:numId="6">
+  <w:num w:numId="6" w16cid:durableId="2033679456">
     <w:abstractNumId w:val="3"/>
   </w:num>
-  <w:num w:numId="7">
+  <w:num w:numId="7" w16cid:durableId="2097434064">
     <w:abstractNumId w:val="2"/>
   </w:num>
-  <w:num w:numId="8">
+  <w:num w:numId="8" w16cid:durableId="504247552">
     <w:abstractNumId w:val="1"/>
   </w:num>
-  <w:num w:numId="9">
+  <w:num w:numId="9" w16cid:durableId="294676944">
     <w:abstractNumId w:val="0"/>
   </w:num>
 </w:numbering>
 </file>
 
 <file path=word/styles.xml><?xml version="1.0" encoding="utf-8"?>
-<w:styles xmlns:mc="http://schemas.openxmlformats.org/markup-compatibility/2006" xmlns:r="http://schemas.openxmlformats.org/officeDocument/2006/relationships" xmlns:w="http://schemas.openxmlformats.org/wordprocessingml/2006/main" xmlns:w14="http://schemas.microsoft.com/office/word/2010/wordml" xmlns:w15="http://schemas.microsoft.com/office/word/2012/wordml" xmlns:w16cex="http://schemas.microsoft.com/office/word/2018/wordml/cex" xmlns:w16cid="http://schemas.microsoft.com/office/word/2016/wordml/cid" xmlns:w16="http://schemas.microsoft.com/office/word/2018/wordml" xmlns:w16sdtdh="http://schemas.microsoft.com/office/word/2020/wordml/sdtdatahash" xmlns:w16se="http://schemas.microsoft.com/office/word/2015/wordml/symex" mc:Ignorable="w14 w15 w16se w16cid w16 w16cex w16sdtdh">
+<w:styles xmlns:mc="http://schemas.openxmlformats.org/markup-compatibility/2006" xmlns:r="http://schemas.openxmlformats.org/officeDocument/2006/relationships" xmlns:w="http://schemas.openxmlformats.org/wordprocessingml/2006/main" xmlns:w14="http://schemas.microsoft.com/office/word/2010/wordml" xmlns:w15="http://schemas.microsoft.com/office/word/2012/wordml" xmlns:w16cex="http://schemas.microsoft.com/office/word/2018/wordml/cex" xmlns:w16cid="http://schemas.microsoft.com/office/word/2016/wordml/cid" xmlns:w16="http://schemas.microsoft.com/office/word/2018/wordml" xmlns:w16du="http://schemas.microsoft.com/office/word/2023/wordml/word16du" xmlns:w16sdtdh="http://schemas.microsoft.com/office/word/2020/wordml/sdtdatahash" xmlns:w16sdtfl="http://schemas.microsoft.com/office/word/2024/wordml/sdtformatlock" xmlns:w16se="http://schemas.microsoft.com/office/word/2015/wordml/symex" mc:Ignorable="w14 w15 w16se w16cid w16 w16cex w16sdtdh w16sdtfl w16du">
   <w:docDefaults>
     <w:rPrDefault>
       <w:rPr>

</xml_diff>